<commit_message>
Update Document : BaoCao !
</commit_message>
<xml_diff>
--- a/Document/BiaChinh_BiaPhu.docx
+++ b/Document/BiaChinh_BiaPhu.docx
@@ -138,6 +138,7 @@
         <w:rPr>
           <w:rFonts w:ascii="Times New Roman" w:hAnsi="Times New Roman" w:cs="Times New Roman"/>
           <w:b/>
+          <w:noProof/>
           <w:sz w:val="32"/>
           <w:szCs w:val="32"/>
         </w:rPr>
@@ -1878,8 +1879,8 @@
         <w:rPr>
           <w:rFonts w:ascii="Times New Roman" w:hAnsi="Times New Roman" w:cs="Times New Roman"/>
           <w:bCs/>
-          <w:sz w:val="32"/>
-          <w:szCs w:val="32"/>
+          <w:sz w:val="26"/>
+          <w:szCs w:val="26"/>
           <w:lang w:val="vi-VN"/>
         </w:rPr>
         <w:sectPr>
@@ -1895,6 +1896,16 @@
           <w:docGrid w:linePitch="360"/>
         </w:sectPr>
       </w:pPr>
+      <w:r>
+        <w:rPr>
+          <w:rFonts w:ascii="Times New Roman" w:hAnsi="Times New Roman" w:cs="Times New Roman"/>
+          <w:bCs/>
+          <w:sz w:val="26"/>
+          <w:szCs w:val="26"/>
+          <w:lang w:val="vi-VN"/>
+        </w:rPr>
+        <w:t>;kngfasl;ègna èahiefna /èlikha èlaijefnl aeefn;poaefn</w:t>
+      </w:r>
     </w:p>
     <w:p>
       <w:pPr>
@@ -2571,6 +2582,7 @@
   <w:style w:type="character" w:default="1" w:styleId="DefaultParagraphFont">
     <w:name w:val="Default Paragraph Font"/>
     <w:uiPriority w:val="1"/>
+    <w:semiHidden/>
     <w:unhideWhenUsed/>
   </w:style>
   <w:style w:type="table" w:default="1" w:styleId="TableNormal">

</xml_diff>